<commit_message>
added CURD operation for proxmox agent
</commit_message>
<xml_diff>
--- a/Oz_SharkTank_Document.docx
+++ b/Oz_SharkTank_Document.docx
@@ -161,7 +161,7 @@
               <w:rPr>
                 <w:color w:val="1E293B"/>
               </w:rPr>
-              <w:t>1.0 — June 2026</w:t>
+              <w:t>1.2 — June 2026</w:t>
             </w:r>
           </w:p>
         </w:tc>
@@ -793,13 +793,12 @@
           <w:color w:val="4F46E5"/>
           <w:sz w:val="20"/>
         </w:rPr>
-        <w:t xml:space="preserve">✦  Cloudflare Edge AI Agents:  </w:t>
+        <w:t>✦  Cloudflare Edge AI Agents:  Purpose-built Workers running Llama 4 Scout 17B at Cloudflare's global edge. Zero cold start. Sub-100ms from anywhere in the world. Optimised for minimal token usage: dynamic tool selection routes only relevant tools per request (reducing input tokens 75–80%), prompt caching via x-session-affinity routes all agentic loop steps to the same Workers AI instance for cache hits, and step limits are capped per agent type (5 for Docker, 7 for health and Proxmox).</w:t>
       </w:r>
       <w:r>
         <w:rPr>
           <w:sz w:val="20"/>
         </w:rPr>
-        <w:t>Purpose-built Workers running Llama 4 Scout 17B at Cloudflare's global edge. Zero cold start. Sub-100ms from anywhere in the world.</w:t>
       </w:r>
     </w:p>
     <w:p>
@@ -926,13 +925,12 @@
           <w:color w:val="4F46E5"/>
           <w:sz w:val="20"/>
         </w:rPr>
-        <w:t xml:space="preserve">✦  Structured HTML Responses:  </w:t>
+        <w:t>✦  Structured HTML Responses:  Output rendered into clean, dark-themed HTML cards with: agent-type headers (🐳 Docker / ❤️ Health / 🖥️ Proxmox), HEALTHY / WARNING / CRITICAL status badges, markdown headings and inline formatting (bold, italic, inline code), code fence blocks, markdown pipe tables, Docker CLI tables with status dots, key-value metric cards, and log blocks — not raw text dumps.</w:t>
       </w:r>
       <w:r>
         <w:rPr>
           <w:sz w:val="20"/>
         </w:rPr>
-        <w:t>Output is formatted into clean HTML cards — tables with status dots, dark log blocks, key-value metric cards — not raw text dumps.</w:t>
       </w:r>
     </w:p>
     <w:p>
@@ -1023,7 +1021,15 @@
                 <w:color w:val="4F46E5"/>
                 <w:sz w:val="22"/>
               </w:rPr>
-              <w:t xml:space="preserve">🐳  Docker Container Management  </w:t>
+              <w:t>🐳  Docker Container Management  [cloudflare_docker_agent]</w:t>
+              <w:br/>
+              <w:t>Endpoint: https://cf-docker-agent.rohit-darekar.workers.dev</w:t>
+              <w:br/>
+              <w:t>Tools: 11 tools: list_containers, inspect_container, get_container_logs, container_stats, run_container, start_container, stop_container, remove_container, list_images, exec_in_container, docker_system_info</w:t>
+              <w:br/>
+              <w:t>Dynamic tool selection: routes only 2–5 relevant tools per request (reduces input tokens ~75%).</w:t>
+              <w:br/>
+              <w:t>List containers, fetch logs, get CPU/memory stats, exec commands, start/stop/remove/create containers.</w:t>
             </w:r>
             <w:r>
               <w:rPr>
@@ -1114,7 +1120,27 @@
                 <w:color w:val="4F46E5"/>
                 <w:sz w:val="22"/>
               </w:rPr>
-              <w:t xml:space="preserve">🖥️  Server Health Monitoring  </w:t>
+              <w:t>❤️  Server Health Monitoring  [cloudflare_server_health_agent]</w:t>
+              <w:br/>
+              <w:t>Endpoint: https://cf-server-health-agent.rohit-darekar.workers.dev</w:t>
+              <w:br/>
+              <w:t>Tools: 5 tools: system_info, disk_usage, list_containers, get_resource_usage, exec_in_container</w:t>
+              <w:br/>
+              <w:t>Max runtime: 180s (7 tool-call steps). Executes a fixed 6-step health procedure:</w:t>
+              <w:br/>
+              <w:t xml:space="preserve">  1. system_info — OS, CPU count, Docker version, container counts</w:t>
+              <w:br/>
+              <w:t xml:space="preserve">  2. list_containers — full inventory, stopped/restarting containers</w:t>
+              <w:br/>
+              <w:t xml:space="preserve">  3. get_resource_usage — per-container CPU and memory</w:t>
+              <w:br/>
+              <w:t xml:space="preserve">  4. disk_usage — Docker disk footprint (images, containers, volumes)</w:t>
+              <w:br/>
+              <w:t xml:space="preserve">  5. exec df -h — host filesystem usage from inside a running container</w:t>
+              <w:br/>
+              <w:t xml:space="preserve">  6. exec free -h &amp;&amp; uptime — RAM and load average</w:t>
+              <w:br/>
+              <w:t>Outputs structured HEALTHY / WARNING / CRITICAL report with per-section findings.</w:t>
             </w:r>
             <w:r>
               <w:rPr>
@@ -1205,7 +1231,33 @@
                 <w:color w:val="4F46E5"/>
                 <w:sz w:val="22"/>
               </w:rPr>
-              <w:t xml:space="preserve">⚡  Proxmox VE Hypervisor Management  </w:t>
+              <w:t>⚡  Proxmox VE Hypervisor Management  [cloudflare_proxmox_agent]</w:t>
+              <w:br/>
+              <w:t>Endpoint: https://cf-proxmox-agent.rohit-darekar.workers.dev</w:t>
+              <w:br/>
+              <w:t>Tools: 27 tools across 8 categories:</w:t>
+              <w:br/>
+              <w:t xml:space="preserve">  Cluster: get_cluster_status, get_cluster_resources</w:t>
+              <w:br/>
+              <w:t xml:space="preserve">  Nodes: list_nodes, get_node_status, list_node_network, get_node_tasks</w:t>
+              <w:br/>
+              <w:t xml:space="preserve">  VMs: list_vms, get_vm_status, get_vm_config, vm_action</w:t>
+              <w:br/>
+              <w:t xml:space="preserve">  VM Snapshots: list_vm_snapshots, create_vm_snapshot, rollback_vm_snapshot, delete_vm_snapshot</w:t>
+              <w:br/>
+              <w:t xml:space="preserve">  LXC: list_containers, get_container_status, get_container_config, container_action, list_container_snapshots</w:t>
+              <w:br/>
+              <w:t xml:space="preserve">  Storage: list_storage, list_storage_content</w:t>
+              <w:br/>
+              <w:t xml:space="preserve">  Provisioning: get_next_vmid, clone_vm, wait_for_task, set_vm_cloudinit, resize_vm_disk, get_vm_ip</w:t>
+              <w:br/>
+              <w:t>Dynamic tool selection: 8 intent groups (provision, power, snapshot, lxc, storage, network, tasks, overview).</w:t>
+              <w:br/>
+              <w:t>VM Provisioning: full end-to-end clone from cloud-init template → wait_for_task → cloud-init config → start → IP.</w:t>
+              <w:br/>
+              <w:t>Secure passwords: cryptographically random 16-char passwords generated per-provision (never guessed).</w:t>
+              <w:br/>
+              <w:t>Async task handling: wait_for_task polls Proxmox UPID until clone finishes before proceeding.</w:t>
             </w:r>
             <w:r>
               <w:rPr>
@@ -1625,11 +1677,7 @@
           </w:tcPr>
           <w:p>
             <w:r>
-              <w:rPr>
-                <w:color w:val="6B7280"/>
-                <w:sz w:val="16"/>
-              </w:rPr>
-              <w:t>VM &amp; LXC management ✅ (13 tools: cluster, nodes, VMs, containers, storage, snapshots)</w:t>
+              <w:t>VM &amp; LXC management ✅ (27 tools: cluster, nodes, VMs, snapshots, LXC, storage, provisioning, tasks)</w:t>
             </w:r>
           </w:p>
         </w:tc>
@@ -3043,7 +3091,7 @@
                 <w:color w:val="4F46E5"/>
                 <w:sz w:val="18"/>
               </w:rPr>
-              <w:t>Llama 3.1 / Mistral via OpenRouter</w:t>
+              <w:t>Cloudflare Workers AI — Llama 3.1 8B (fp8-fast)</w:t>
             </w:r>
           </w:p>
         </w:tc>
@@ -3057,7 +3105,7 @@
                 <w:color w:val="6B7280"/>
                 <w:sz w:val="18"/>
               </w:rPr>
-              <w:t>Intent classification and entity extraction</w:t>
+              <w:t>Zero-cost inference for Leon NLU; same CF account as edge agents</w:t>
             </w:r>
           </w:p>
         </w:tc>

</xml_diff>